<commit_message>
Confirm ISBN 979-8-90690-376-1 for volume 289: Word, PDFs, covers and catalogue synchronized
</commit_message>
<xml_diff>
--- a/public/books/education-subject-rebirth/downloads/education-subject-rebirth.docx
+++ b/public/books/education-subject-rebirth/downloads/education-subject-rebirth.docx
@@ -221,7 +221,7 @@
         <w:spacing w:after="120"/>
       </w:pPr>
       <w:r>
-        <w:t>ISBN　待确认</w:t>
+        <w:t>ISBN　979-8-90690-376-1</w:t>
       </w:r>
     </w:p>
     <w:p>
@@ -275,7 +275,7 @@
         <w:pageBreakBefore w:val="0"/>
       </w:pPr>
       <w:r>
-        <w:t>第289卷与定价由作者确认，ISBN另行核对。印刷校样供版式复核；纸张、出血、书脊与装订参数须由承印厂另行确认。</w:t>
+        <w:t>第289卷、ISBN及定价由作者确认。印刷校样供版式复核；纸张、出血、书脊与装订参数须由承印厂另行确认。</w:t>
       </w:r>
     </w:p>
     <w:p>

</xml_diff>